<commit_message>
Add Day 6 batch processing pipelines and PostgreSQL setup
- Created pipeline for enriching orders with product data (02_enrich_orders.hpl).
- Implemented pipeline to write cleaned customer data to PostgreSQL (03_write_customers_postgres.hpl).
- Added pipeline to read cleaned customers from PostgreSQL and generate verification CSV (04_read_customers_postgres.hpl).
- Developed pipeline to consume Kafka CDC events and process orders (05_consume_orders_kafka.hpl).
- Created sub-pipeline for processing Kafka order events, including deduplication and aggregation (06_kafka_order_batch_subpipeline.hpl).
- Added requirements file for Kafka Python library (requirements.txt).
- Created SQL setup script for PostgreSQL tables (setup_postgresql.sql).
- Implemented orchestration workflow for Day 6 batch processes (01_day6_batch_orchestration.hwf).
</commit_message>
<xml_diff>
--- a/Week_02/Day_06/Lab/Day_06_Lab_Guide.docx
+++ b/Week_02/Day_06/Lab/Day_06_Lab_Guide.docx
@@ -4,23 +4,35 @@
   <w:body>
     <w:p>
       <w:pPr>
-        <w:pStyle w:val="Title"/>
-        <w:jc w:val="center"/>
+        <w:spacing w:after="60"/>
+        <w:jc w:val="left"/>
       </w:pPr>
       <w:r>
-        <w:t>Day 6 Lab Instructions</w:t>
+        <w:rPr>
+          <w:rFonts w:ascii="Calibri" w:hAnsi="Calibri"/>
+          <w:color w:val="000000"/>
+          <w:sz w:val="52"/>
+        </w:rPr>
+        <w:t>Day 6 Lab Guide</w:t>
       </w:r>
     </w:p>
     <w:p>
       <w:pPr>
-        <w:jc w:val="center"/>
+        <w:spacing w:after="240"/>
       </w:pPr>
+      <w:r>
+        <w:t>Data Transformation with Apache Hop: architecture, first pipeline, CSV batch, PostgreSQL, Kafka, and workflow orchestration</w:t>
+      </w:r>
+    </w:p>
+    <w:p>
       <w:r>
         <w:rPr>
           <w:b/>
-          <w:sz w:val="28"/>
         </w:rPr>
-        <w:t>Data Transformation with Apache Hop, Kafka, and Docker</w:t>
+        <w:t xml:space="preserve">Outcome: </w:t>
+      </w:r>
+      <w:r>
+        <w:t>Students build a realistic Apache Hop project that starts with the first-pipeline pattern from Samuel Second?s Medium walkthrough, then extends it into cleaning, enrichment, database IO, Kafka streaming, and workflow orchestration.</w:t>
       </w:r>
     </w:p>
     <w:p>
@@ -28,37 +40,249 @@
         <w:pStyle w:val="Heading1"/>
       </w:pPr>
       <w:r>
-        <w:t>Lab Outcome</w:t>
-      </w:r>
-    </w:p>
-    <w:p>
-      <w:r>
-        <w:t>Build and verify Day 6 data transformation exercises using Apache Hop Web, Kafka, Schema Registry, Kafka UI, and runnable validation scripts. This guide now includes real Ubuntu desktop screenshots captured with gnome-screenshot.</w:t>
+        <w:t>Required Services</w:t>
       </w:r>
     </w:p>
     <w:tbl>
       <w:tblPr>
+        <w:tblStyle w:val="TableGrid"/>
         <w:tblW w:type="auto" w:w="0"/>
+        <w:jc w:val="left"/>
         <w:tblLook w:firstColumn="1" w:firstRow="1" w:lastColumn="0" w:lastRow="0" w:noHBand="0" w:noVBand="1" w:val="04A0"/>
       </w:tblPr>
       <w:tblGrid>
-        <w:gridCol w:w="10368"/>
+        <w:gridCol w:w="3120"/>
+        <w:gridCol w:w="3120"/>
+        <w:gridCol w:w="3120"/>
       </w:tblGrid>
       <w:tr>
         <w:tc>
           <w:tcPr>
-            <w:tcW w:type="dxa" w:w="10368"/>
-            <w:shd w:fill="EAF7EE"/>
+            <w:tcW w:type="dxa" w:w="2376"/>
+            <w:shd w:fill="E8EEF5"/>
+            <w:vAlign w:val="center"/>
           </w:tcPr>
           <w:p>
+            <w:pPr>
+              <w:spacing w:after="0"/>
+            </w:pPr>
             <w:r>
               <w:rPr>
                 <w:b/>
               </w:rPr>
-              <w:t xml:space="preserve">Screenshot evidence: </w:t>
+              <w:t>Service</w:t>
             </w:r>
+          </w:p>
+        </w:tc>
+        <w:tc>
+          <w:tcPr>
+            <w:tcW w:type="dxa" w:w="3096"/>
+            <w:shd w:fill="E8EEF5"/>
+            <w:vAlign w:val="center"/>
+          </w:tcPr>
+          <w:p>
+            <w:pPr>
+              <w:spacing w:after="0"/>
+            </w:pPr>
             <w:r>
-              <w:t>The screenshots in this document are actual desktop captures from the running Ubuntu session, not generated mockups.</w:t>
+              <w:rPr>
+                <w:b/>
+              </w:rPr>
+              <w:t>URL / Port</w:t>
+            </w:r>
+          </w:p>
+        </w:tc>
+        <w:tc>
+          <w:tcPr>
+            <w:tcW w:type="dxa" w:w="3888"/>
+            <w:shd w:fill="E8EEF5"/>
+            <w:vAlign w:val="center"/>
+          </w:tcPr>
+          <w:p>
+            <w:pPr>
+              <w:spacing w:after="0"/>
+            </w:pPr>
+            <w:r>
+              <w:rPr>
+                <w:b/>
+              </w:rPr>
+              <w:t>Why it is included</w:t>
+            </w:r>
+          </w:p>
+        </w:tc>
+      </w:tr>
+      <w:tr>
+        <w:tc>
+          <w:tcPr>
+            <w:tcW w:type="dxa" w:w="2376"/>
+            <w:vAlign w:val="center"/>
+          </w:tcPr>
+          <w:p>
+            <w:pPr>
+              <w:spacing w:after="0"/>
+            </w:pPr>
+            <w:r>
+              <w:t>Apache Hop Web</w:t>
+            </w:r>
+          </w:p>
+        </w:tc>
+        <w:tc>
+          <w:tcPr>
+            <w:tcW w:type="dxa" w:w="3096"/>
+            <w:vAlign w:val="center"/>
+          </w:tcPr>
+          <w:p>
+            <w:pPr>
+              <w:spacing w:after="0"/>
+            </w:pPr>
+            <w:r>
+              <w:t>http://localhost:8082/ui</w:t>
+            </w:r>
+          </w:p>
+        </w:tc>
+        <w:tc>
+          <w:tcPr>
+            <w:tcW w:type="dxa" w:w="3888"/>
+            <w:vAlign w:val="center"/>
+          </w:tcPr>
+          <w:p>
+            <w:pPr>
+              <w:spacing w:after="0"/>
+            </w:pPr>
+            <w:r>
+              <w:t>Required visual designer for creating and running Hop pipelines/workflows in the browser.</w:t>
+            </w:r>
+          </w:p>
+        </w:tc>
+      </w:tr>
+      <w:tr>
+        <w:tc>
+          <w:tcPr>
+            <w:tcW w:type="dxa" w:w="2376"/>
+            <w:vAlign w:val="center"/>
+          </w:tcPr>
+          <w:p>
+            <w:pPr>
+              <w:spacing w:after="0"/>
+            </w:pPr>
+            <w:r>
+              <w:t>Kafka UI</w:t>
+            </w:r>
+          </w:p>
+        </w:tc>
+        <w:tc>
+          <w:tcPr>
+            <w:tcW w:type="dxa" w:w="3096"/>
+            <w:vAlign w:val="center"/>
+          </w:tcPr>
+          <w:p>
+            <w:pPr>
+              <w:spacing w:after="0"/>
+            </w:pPr>
+            <w:r>
+              <w:t>http://localhost:8080</w:t>
+            </w:r>
+          </w:p>
+        </w:tc>
+        <w:tc>
+          <w:tcPr>
+            <w:tcW w:type="dxa" w:w="3888"/>
+            <w:vAlign w:val="center"/>
+          </w:tcPr>
+          <w:p>
+            <w:pPr>
+              <w:spacing w:after="0"/>
+            </w:pPr>
+            <w:r>
+              <w:t>Inspect topics and message counts for the Kafka streaming lab.</w:t>
+            </w:r>
+          </w:p>
+        </w:tc>
+      </w:tr>
+      <w:tr>
+        <w:tc>
+          <w:tcPr>
+            <w:tcW w:type="dxa" w:w="2376"/>
+            <w:vAlign w:val="center"/>
+          </w:tcPr>
+          <w:p>
+            <w:pPr>
+              <w:spacing w:after="0"/>
+            </w:pPr>
+            <w:r>
+              <w:t>Kafka bootstrap</w:t>
+            </w:r>
+          </w:p>
+        </w:tc>
+        <w:tc>
+          <w:tcPr>
+            <w:tcW w:type="dxa" w:w="3096"/>
+            <w:vAlign w:val="center"/>
+          </w:tcPr>
+          <w:p>
+            <w:pPr>
+              <w:spacing w:after="0"/>
+            </w:pPr>
+            <w:r>
+              <w:t>localhost:9092 host; kafka:29092 from Hop</w:t>
+            </w:r>
+          </w:p>
+        </w:tc>
+        <w:tc>
+          <w:tcPr>
+            <w:tcW w:type="dxa" w:w="3888"/>
+            <w:vAlign w:val="center"/>
+          </w:tcPr>
+          <w:p>
+            <w:pPr>
+              <w:spacing w:after="0"/>
+            </w:pPr>
+            <w:r>
+              <w:t>Python producer uses host access; Hop pipelines use the Docker network address.</w:t>
+            </w:r>
+          </w:p>
+        </w:tc>
+      </w:tr>
+      <w:tr>
+        <w:tc>
+          <w:tcPr>
+            <w:tcW w:type="dxa" w:w="2376"/>
+            <w:vAlign w:val="center"/>
+          </w:tcPr>
+          <w:p>
+            <w:pPr>
+              <w:spacing w:after="0"/>
+            </w:pPr>
+            <w:r>
+              <w:t>PostgreSQL</w:t>
+            </w:r>
+          </w:p>
+        </w:tc>
+        <w:tc>
+          <w:tcPr>
+            <w:tcW w:type="dxa" w:w="3096"/>
+            <w:vAlign w:val="center"/>
+          </w:tcPr>
+          <w:p>
+            <w:pPr>
+              <w:spacing w:after="0"/>
+            </w:pPr>
+            <w:r>
+              <w:t>localhost:5432</w:t>
+            </w:r>
+          </w:p>
+        </w:tc>
+        <w:tc>
+          <w:tcPr>
+            <w:tcW w:type="dxa" w:w="3888"/>
+            <w:vAlign w:val="center"/>
+          </w:tcPr>
+          <w:p>
+            <w:pPr>
+              <w:spacing w:after="0"/>
+            </w:pPr>
+            <w:r>
+              <w:t>Real database target/source for Table Output and Table Input labs.</w:t>
             </w:r>
           </w:p>
         </w:tc>
@@ -70,55 +294,73 @@
         <w:pStyle w:val="Heading1"/>
       </w:pPr>
       <w:r>
-        <w:t>Required Services and Ports</w:t>
+        <w:t>Official Hop Docker Images</w:t>
       </w:r>
     </w:p>
     <w:tbl>
       <w:tblPr>
         <w:tblStyle w:val="TableGrid"/>
         <w:tblW w:type="auto" w:w="0"/>
-        <w:jc w:val="center"/>
+        <w:jc w:val="left"/>
         <w:tblLook w:firstColumn="1" w:firstRow="1" w:lastColumn="0" w:lastRow="0" w:noHBand="0" w:noVBand="1" w:val="04A0"/>
       </w:tblPr>
       <w:tblGrid>
-        <w:gridCol w:w="3456"/>
-        <w:gridCol w:w="3456"/>
-        <w:gridCol w:w="3456"/>
+        <w:gridCol w:w="3120"/>
+        <w:gridCol w:w="3120"/>
+        <w:gridCol w:w="3120"/>
       </w:tblGrid>
       <w:tr>
         <w:tc>
           <w:tcPr>
-            <w:tcW w:type="dxa" w:w="3456"/>
-            <w:shd w:fill="D9EAF7"/>
-            <w:vAlign w:val="top"/>
+            <w:tcW w:type="dxa" w:w="2448"/>
+            <w:shd w:fill="E8EEF5"/>
+            <w:vAlign w:val="center"/>
           </w:tcPr>
           <w:p>
+            <w:pPr>
+              <w:spacing w:after="0"/>
+            </w:pPr>
             <w:r>
-              <w:t>Component</w:t>
+              <w:rPr>
+                <w:b/>
+              </w:rPr>
+              <w:t>Image</w:t>
             </w:r>
           </w:p>
         </w:tc>
         <w:tc>
           <w:tcPr>
-            <w:tcW w:type="dxa" w:w="3456"/>
-            <w:shd w:fill="D9EAF7"/>
-            <w:vAlign w:val="top"/>
+            <w:tcW w:type="dxa" w:w="3888"/>
+            <w:shd w:fill="E8EEF5"/>
+            <w:vAlign w:val="center"/>
           </w:tcPr>
           <w:p>
+            <w:pPr>
+              <w:spacing w:after="0"/>
+            </w:pPr>
             <w:r>
-              <w:t>URL / Port</w:t>
+              <w:rPr>
+                <w:b/>
+              </w:rPr>
+              <w:t>Use in this lab</w:t>
             </w:r>
           </w:p>
         </w:tc>
         <w:tc>
           <w:tcPr>
-            <w:tcW w:type="dxa" w:w="3456"/>
-            <w:shd w:fill="D9EAF7"/>
-            <w:vAlign w:val="top"/>
+            <w:tcW w:type="dxa" w:w="3024"/>
+            <w:shd w:fill="E8EEF5"/>
+            <w:vAlign w:val="center"/>
           </w:tcPr>
           <w:p>
+            <w:pPr>
+              <w:spacing w:after="0"/>
+            </w:pPr>
             <w:r>
-              <w:t>Purpose</w:t>
+              <w:rPr>
+                <w:b/>
+              </w:rPr>
+              <w:t>Decision</w:t>
             </w:r>
           </w:p>
         </w:tc>
@@ -126,34 +368,43 @@
       <w:tr>
         <w:tc>
           <w:tcPr>
-            <w:tcW w:type="dxa" w:w="3456"/>
-            <w:vAlign w:val="top"/>
+            <w:tcW w:type="dxa" w:w="2448"/>
+            <w:vAlign w:val="center"/>
           </w:tcPr>
           <w:p>
+            <w:pPr>
+              <w:spacing w:after="0"/>
+            </w:pPr>
             <w:r>
-              <w:t>Apache Hop Web</w:t>
+              <w:t>apache/hop-web</w:t>
             </w:r>
           </w:p>
         </w:tc>
         <w:tc>
           <w:tcPr>
-            <w:tcW w:type="dxa" w:w="3456"/>
-            <w:vAlign w:val="top"/>
+            <w:tcW w:type="dxa" w:w="3888"/>
+            <w:vAlign w:val="center"/>
           </w:tcPr>
           <w:p>
+            <w:pPr>
+              <w:spacing w:after="0"/>
+            </w:pPr>
             <w:r>
-              <w:t>http://localhost:8082/ui</w:t>
+              <w:t>Browser-based Hop GUI running on Tomcat.</w:t>
             </w:r>
           </w:p>
         </w:tc>
         <w:tc>
           <w:tcPr>
-            <w:tcW w:type="dxa" w:w="3456"/>
-            <w:vAlign w:val="top"/>
+            <w:tcW w:type="dxa" w:w="3024"/>
+            <w:vAlign w:val="center"/>
           </w:tcPr>
           <w:p>
+            <w:pPr>
+              <w:spacing w:after="0"/>
+            </w:pPr>
             <w:r>
-              <w:t>Browser-based Hop UI for visual pipeline/workflow design.</w:t>
+              <w:t>Required. This is the main learner interface.</w:t>
             </w:r>
           </w:p>
         </w:tc>
@@ -161,34 +412,43 @@
       <w:tr>
         <w:tc>
           <w:tcPr>
-            <w:tcW w:type="dxa" w:w="3456"/>
-            <w:vAlign w:val="top"/>
+            <w:tcW w:type="dxa" w:w="2448"/>
+            <w:vAlign w:val="center"/>
           </w:tcPr>
           <w:p>
+            <w:pPr>
+              <w:spacing w:after="0"/>
+            </w:pPr>
             <w:r>
-              <w:t>Apache Hop Server</w:t>
+              <w:t>apache/hop</w:t>
             </w:r>
           </w:p>
         </w:tc>
         <w:tc>
           <w:tcPr>
-            <w:tcW w:type="dxa" w:w="3456"/>
-            <w:vAlign w:val="top"/>
+            <w:tcW w:type="dxa" w:w="3888"/>
+            <w:vAlign w:val="center"/>
           </w:tcPr>
           <w:p>
+            <w:pPr>
+              <w:spacing w:after="0"/>
+            </w:pPr>
             <w:r>
-              <w:t>http://localhost:8181</w:t>
+              <w:t>Main client/server image for CLI execution and Hop Server-style runtime.</w:t>
             </w:r>
           </w:p>
         </w:tc>
         <w:tc>
           <w:tcPr>
-            <w:tcW w:type="dxa" w:w="3456"/>
-            <w:vAlign w:val="top"/>
+            <w:tcW w:type="dxa" w:w="3024"/>
+            <w:vAlign w:val="center"/>
           </w:tcPr>
           <w:p>
+            <w:pPr>
+              <w:spacing w:after="0"/>
+            </w:pPr>
             <w:r>
-              <w:t>Runtime/status endpoint. This is not the visual designer.</w:t>
+              <w:t>Optional profile: hop-cli. Useful for validation or automation, not needed for first visual build.</w:t>
             </w:r>
           </w:p>
         </w:tc>
@@ -196,34 +456,43 @@
       <w:tr>
         <w:tc>
           <w:tcPr>
-            <w:tcW w:type="dxa" w:w="3456"/>
-            <w:vAlign w:val="top"/>
+            <w:tcW w:type="dxa" w:w="2448"/>
+            <w:vAlign w:val="center"/>
           </w:tcPr>
           <w:p>
+            <w:pPr>
+              <w:spacing w:after="0"/>
+            </w:pPr>
             <w:r>
-              <w:t>Kafka UI</w:t>
+              <w:t>apache/hop-web-beam</w:t>
             </w:r>
           </w:p>
         </w:tc>
         <w:tc>
           <w:tcPr>
-            <w:tcW w:type="dxa" w:w="3456"/>
-            <w:vAlign w:val="top"/>
+            <w:tcW w:type="dxa" w:w="3888"/>
+            <w:vAlign w:val="center"/>
           </w:tcPr>
           <w:p>
+            <w:pPr>
+              <w:spacing w:after="0"/>
+            </w:pPr>
             <w:r>
-              <w:t>http://localhost:8080/ui/clusters/local/all-topics</w:t>
+              <w:t>Hop Web with Beam fat jar for Google Cloud Dataflow integration.</w:t>
             </w:r>
           </w:p>
         </w:tc>
         <w:tc>
           <w:tcPr>
-            <w:tcW w:type="dxa" w:w="3456"/>
-            <w:vAlign w:val="top"/>
+            <w:tcW w:type="dxa" w:w="3024"/>
+            <w:vAlign w:val="center"/>
           </w:tcPr>
           <w:p>
+            <w:pPr>
+              <w:spacing w:after="0"/>
+            </w:pPr>
             <w:r>
-              <w:t>View topics and message counts.</w:t>
+              <w:t>Not required. Day 6 does not deploy to Dataflow.</w:t>
             </w:r>
           </w:p>
         </w:tc>
@@ -231,34 +500,206 @@
       <w:tr>
         <w:tc>
           <w:tcPr>
-            <w:tcW w:type="dxa" w:w="3456"/>
-            <w:vAlign w:val="top"/>
+            <w:tcW w:type="dxa" w:w="2448"/>
+            <w:vAlign w:val="center"/>
           </w:tcPr>
           <w:p>
+            <w:pPr>
+              <w:spacing w:after="0"/>
+            </w:pPr>
             <w:r>
-              <w:t>Schema Registry</w:t>
+              <w:t>apache/hop-dataflow-template</w:t>
             </w:r>
           </w:p>
         </w:tc>
         <w:tc>
           <w:tcPr>
-            <w:tcW w:type="dxa" w:w="3456"/>
-            <w:vAlign w:val="top"/>
+            <w:tcW w:type="dxa" w:w="3888"/>
+            <w:vAlign w:val="center"/>
           </w:tcPr>
           <w:p>
+            <w:pPr>
+              <w:spacing w:after="0"/>
+            </w:pPr>
             <w:r>
-              <w:t>http://localhost:8081</w:t>
+              <w:t>Google Cloud Dataflow Flex Template image.</w:t>
             </w:r>
           </w:p>
         </w:tc>
         <w:tc>
           <w:tcPr>
-            <w:tcW w:type="dxa" w:w="3456"/>
-            <w:vAlign w:val="top"/>
+            <w:tcW w:type="dxa" w:w="3024"/>
+            <w:vAlign w:val="center"/>
           </w:tcPr>
           <w:p>
+            <w:pPr>
+              <w:spacing w:after="0"/>
+            </w:pPr>
             <w:r>
-              <w:t>Schema Registry API endpoint.</w:t>
+              <w:t>Not required. Use only for a dedicated Dataflow deployment lab.</w:t>
+            </w:r>
+          </w:p>
+        </w:tc>
+      </w:tr>
+    </w:tbl>
+    <w:p/>
+    <w:p>
+      <w:pPr>
+        <w:pStyle w:val="Heading1"/>
+      </w:pPr>
+      <w:r>
+        <w:t>Why Projects Are Required</w:t>
+      </w:r>
+    </w:p>
+    <w:p>
+      <w:pPr>
+        <w:pStyle w:val="ListBullet"/>
+      </w:pPr>
+      <w:r>
+        <w:t>A project groups the actual data solution: pipelines, workflows, metadata, reference files, and lab data.</w:t>
+      </w:r>
+    </w:p>
+    <w:p>
+      <w:pPr>
+        <w:pStyle w:val="ListBullet"/>
+      </w:pPr>
+      <w:r>
+        <w:t>Projects make the work Git-friendly and portable across machines.</w:t>
+      </w:r>
+    </w:p>
+    <w:p>
+      <w:pPr>
+        <w:pStyle w:val="ListBullet"/>
+      </w:pPr>
+      <w:r>
+        <w:t>Environment-specific values such as database hosts and credentials should be separated from pipeline logic.</w:t>
+      </w:r>
+    </w:p>
+    <w:p>
+      <w:pPr>
+        <w:pStyle w:val="ListBullet"/>
+      </w:pPr>
+      <w:r>
+        <w:t>In this lab, /project is mounted from Lab_Files so Hop Web can open pipelines, workflows, data, and metadata consistently.</w:t>
+      </w:r>
+    </w:p>
+    <w:p>
+      <w:pPr>
+        <w:pStyle w:val="Heading1"/>
+      </w:pPr>
+      <w:r>
+        <w:t>Hop Architecture</w:t>
+      </w:r>
+    </w:p>
+    <w:p>
+      <w:pPr>
+        <w:pStyle w:val="ListBullet"/>
+      </w:pPr>
+      <w:r>
+        <w:t>Hop Engine: runtime core used by Hop GUI, Hop Run, and Hop Server-style execution.</w:t>
+      </w:r>
+    </w:p>
+    <w:p>
+      <w:pPr>
+        <w:pStyle w:val="ListBullet"/>
+      </w:pPr>
+      <w:r>
+        <w:t>Project: the folder containing pipelines, workflows, metadata, and data assets.</w:t>
+      </w:r>
+    </w:p>
+    <w:p>
+      <w:pPr>
+        <w:pStyle w:val="ListBullet"/>
+      </w:pPr>
+      <w:r>
+        <w:t>Metadata: reusable definitions such as database connections, run configurations, probes, logs, and schemas.</w:t>
+      </w:r>
+    </w:p>
+    <w:p>
+      <w:pPr>
+        <w:pStyle w:val="ListBullet"/>
+      </w:pPr>
+      <w:r>
+        <w:t>Pipeline: row-level data flow made of transforms connected by hops.</w:t>
+      </w:r>
+    </w:p>
+    <w:p>
+      <w:pPr>
+        <w:pStyle w:val="ListBullet"/>
+      </w:pPr>
+      <w:r>
+        <w:t>Workflow: orchestration flow made of actions connected by success/failure/unconditional hops.</w:t>
+      </w:r>
+    </w:p>
+    <w:p>
+      <w:pPr>
+        <w:pStyle w:val="ListBullet"/>
+      </w:pPr>
+      <w:r>
+        <w:t>Run configuration: tells Hop where and how to execute, such as local/native or Beam-based engines.</w:t>
+      </w:r>
+    </w:p>
+    <w:p>
+      <w:pPr>
+        <w:pStyle w:val="ListBullet"/>
+      </w:pPr>
+      <w:r>
+        <w:t>Environment: externalizes variables for dev/test/prod differences.</w:t>
+      </w:r>
+    </w:p>
+    <w:p>
+      <w:pPr>
+        <w:pStyle w:val="Heading1"/>
+      </w:pPr>
+      <w:r>
+        <w:t>Transform, Action, And Metadata Catalog</w:t>
+      </w:r>
+    </w:p>
+    <w:tbl>
+      <w:tblPr>
+        <w:tblStyle w:val="TableGrid"/>
+        <w:tblW w:type="auto" w:w="0"/>
+        <w:jc w:val="left"/>
+        <w:tblLook w:firstColumn="1" w:firstRow="1" w:lastColumn="0" w:lastRow="0" w:noHBand="0" w:noVBand="1" w:val="04A0"/>
+      </w:tblPr>
+      <w:tblGrid>
+        <w:gridCol w:w="4680"/>
+        <w:gridCol w:w="4680"/>
+      </w:tblGrid>
+      <w:tr>
+        <w:tc>
+          <w:tcPr>
+            <w:tcW w:type="dxa" w:w="2448"/>
+            <w:shd w:fill="E8EEF5"/>
+            <w:vAlign w:val="center"/>
+          </w:tcPr>
+          <w:p>
+            <w:pPr>
+              <w:spacing w:after="0"/>
+            </w:pPr>
+            <w:r>
+              <w:rPr>
+                <w:b/>
+              </w:rPr>
+              <w:t>Area</w:t>
+            </w:r>
+          </w:p>
+        </w:tc>
+        <w:tc>
+          <w:tcPr>
+            <w:tcW w:type="dxa" w:w="6912"/>
+            <w:shd w:fill="E8EEF5"/>
+            <w:vAlign w:val="center"/>
+          </w:tcPr>
+          <w:p>
+            <w:pPr>
+              <w:spacing w:after="0"/>
+            </w:pPr>
+            <w:r>
+              <w:rPr>
+                <w:b/>
+              </w:rPr>
+              <w:t>Common examples to know</w:t>
             </w:r>
           </w:p>
         </w:tc>
@@ -266,147 +707,431 @@
       <w:tr>
         <w:tc>
           <w:tcPr>
-            <w:tcW w:type="dxa" w:w="3456"/>
-            <w:vAlign w:val="top"/>
+            <w:tcW w:type="dxa" w:w="2448"/>
+            <w:vAlign w:val="center"/>
           </w:tcPr>
           <w:p>
+            <w:pPr>
+              <w:spacing w:after="0"/>
+            </w:pPr>
             <w:r>
-              <w:t>Kafka bootstrap</w:t>
+              <w:t>Pipeline transforms</w:t>
             </w:r>
           </w:p>
         </w:tc>
         <w:tc>
           <w:tcPr>
-            <w:tcW w:type="dxa" w:w="3456"/>
-            <w:vAlign w:val="top"/>
+            <w:tcW w:type="dxa" w:w="6912"/>
+            <w:vAlign w:val="center"/>
           </w:tcPr>
           <w:p>
+            <w:pPr>
+              <w:spacing w:after="0"/>
+            </w:pPr>
             <w:r>
-              <w:t>localhost:9092</w:t>
+              <w:t>CSV File Input, Text File Output, Table Input, Table Output, Kafka Consumer, Kafka Producer, Filter Rows, Select Values, Formula, Calculator, JavaScript, Sort Rows, Unique Rows, Group By, Merge Join, Stream Lookup, Database Lookup, JSON Input, JSON Output, Data Validator, Write to Log.</w:t>
+            </w:r>
+          </w:p>
+        </w:tc>
+      </w:tr>
+      <w:tr>
+        <w:tc>
+          <w:tcPr>
+            <w:tcW w:type="dxa" w:w="2448"/>
+            <w:vAlign w:val="center"/>
+          </w:tcPr>
+          <w:p>
+            <w:pPr>
+              <w:spacing w:after="0"/>
+            </w:pPr>
+            <w:r>
+              <w:t>Workflow actions</w:t>
             </w:r>
           </w:p>
         </w:tc>
         <w:tc>
           <w:tcPr>
-            <w:tcW w:type="dxa" w:w="3456"/>
-            <w:vAlign w:val="top"/>
+            <w:tcW w:type="dxa" w:w="6912"/>
+            <w:vAlign w:val="center"/>
           </w:tcPr>
           <w:p>
+            <w:pPr>
+              <w:spacing w:after="0"/>
+            </w:pPr>
             <w:r>
-              <w:t>Host Python producer/consumer connection.</w:t>
+              <w:t>Start, Success, Abort, Pipeline, Workflow, SQL, Shell, Set Variables, File Exists, Copy/Move/Delete files, Wait for File, Wait for SQL, Mail, Write to Log, Zip/Unzip, HTTP, XSD validator.</w:t>
+            </w:r>
+          </w:p>
+        </w:tc>
+      </w:tr>
+      <w:tr>
+        <w:tc>
+          <w:tcPr>
+            <w:tcW w:type="dxa" w:w="2448"/>
+            <w:vAlign w:val="center"/>
+          </w:tcPr>
+          <w:p>
+            <w:pPr>
+              <w:spacing w:after="0"/>
+            </w:pPr>
+            <w:r>
+              <w:t>Metadata activities</w:t>
+            </w:r>
+          </w:p>
+        </w:tc>
+        <w:tc>
+          <w:tcPr>
+            <w:tcW w:type="dxa" w:w="6912"/>
+            <w:vAlign w:val="center"/>
+          </w:tcPr>
+          <w:p>
+            <w:pPr>
+              <w:spacing w:after="0"/>
+            </w:pPr>
+            <w:r>
+              <w:t>Relational Database Connection, Pipeline Run Configuration, Workflow Run Configuration, Pipeline Log, Workflow Log, Pipeline Probe, Pipeline Unit Test, Data Set, Static Schema Definition, Execution Information Location, Execution Data Profile, Hop Server, REST Connection, Web Service, Variable Resolver.</w:t>
             </w:r>
           </w:p>
         </w:tc>
       </w:tr>
     </w:tbl>
+    <w:p/>
     <w:p>
       <w:pPr>
         <w:pStyle w:val="Heading1"/>
       </w:pPr>
       <w:r>
-        <w:t>Install / Start with Docker on Linux</w:t>
+        <w:t>Lab Files</w:t>
+      </w:r>
+    </w:p>
+    <w:tbl>
+      <w:tblPr>
+        <w:tblStyle w:val="TableGrid"/>
+        <w:tblW w:type="auto" w:w="0"/>
+        <w:jc w:val="left"/>
+        <w:tblLook w:firstColumn="1" w:firstRow="1" w:lastColumn="0" w:lastRow="0" w:noHBand="0" w:noVBand="1" w:val="04A0"/>
+      </w:tblPr>
+      <w:tblGrid>
+        <w:gridCol w:w="4680"/>
+        <w:gridCol w:w="4680"/>
+      </w:tblGrid>
+      <w:tr>
+        <w:tc>
+          <w:tcPr>
+            <w:tcW w:type="dxa" w:w="3671"/>
+            <w:shd w:fill="E8EEF5"/>
+            <w:vAlign w:val="center"/>
+          </w:tcPr>
+          <w:p>
+            <w:pPr>
+              <w:spacing w:after="0"/>
+            </w:pPr>
+            <w:r>
+              <w:rPr>
+                <w:b/>
+              </w:rPr>
+              <w:t>Path</w:t>
+            </w:r>
+          </w:p>
+        </w:tc>
+        <w:tc>
+          <w:tcPr>
+            <w:tcW w:type="dxa" w:w="5688"/>
+            <w:shd w:fill="E8EEF5"/>
+            <w:vAlign w:val="center"/>
+          </w:tcPr>
+          <w:p>
+            <w:pPr>
+              <w:spacing w:after="0"/>
+            </w:pPr>
+            <w:r>
+              <w:rPr>
+                <w:b/>
+              </w:rPr>
+              <w:t>Use</w:t>
+            </w:r>
+          </w:p>
+        </w:tc>
+      </w:tr>
+      <w:tr>
+        <w:tc>
+          <w:tcPr>
+            <w:tcW w:type="dxa" w:w="3671"/>
+            <w:vAlign w:val="center"/>
+          </w:tcPr>
+          <w:p>
+            <w:pPr>
+              <w:spacing w:after="0"/>
+            </w:pPr>
+            <w:r>
+              <w:t>docker-compose.yml</w:t>
+            </w:r>
+          </w:p>
+        </w:tc>
+        <w:tc>
+          <w:tcPr>
+            <w:tcW w:type="dxa" w:w="5688"/>
+            <w:vAlign w:val="center"/>
+          </w:tcPr>
+          <w:p>
+            <w:pPr>
+              <w:spacing w:after="0"/>
+            </w:pPr>
+            <w:r>
+              <w:t>Starts Hop Web, Kafka, Kafka UI, PostgreSQL, plus optional hop-cli profile.</w:t>
+            </w:r>
+          </w:p>
+        </w:tc>
+      </w:tr>
+      <w:tr>
+        <w:tc>
+          <w:tcPr>
+            <w:tcW w:type="dxa" w:w="3671"/>
+            <w:vAlign w:val="center"/>
+          </w:tcPr>
+          <w:p>
+            <w:pPr>
+              <w:spacing w:after="0"/>
+            </w:pPr>
+            <w:r>
+              <w:t>generate_data.py</w:t>
+            </w:r>
+          </w:p>
+        </w:tc>
+        <w:tc>
+          <w:tcPr>
+            <w:tcW w:type="dxa" w:w="5688"/>
+            <w:vAlign w:val="center"/>
+          </w:tcPr>
+          <w:p>
+            <w:pPr>
+              <w:spacing w:after="0"/>
+            </w:pPr>
+            <w:r>
+              <w:t>Creates CSV input files under data/.</w:t>
+            </w:r>
+          </w:p>
+        </w:tc>
+      </w:tr>
+      <w:tr>
+        <w:tc>
+          <w:tcPr>
+            <w:tcW w:type="dxa" w:w="3671"/>
+            <w:vAlign w:val="center"/>
+          </w:tcPr>
+          <w:p>
+            <w:pPr>
+              <w:spacing w:after="0"/>
+            </w:pPr>
+            <w:r>
+              <w:t>orders_producer.py</w:t>
+            </w:r>
+          </w:p>
+        </w:tc>
+        <w:tc>
+          <w:tcPr>
+            <w:tcW w:type="dxa" w:w="5688"/>
+            <w:vAlign w:val="center"/>
+          </w:tcPr>
+          <w:p>
+            <w:pPr>
+              <w:spacing w:after="0"/>
+            </w:pPr>
+            <w:r>
+              <w:t>Publishes CDC-style JSON events to orders.cdc.</w:t>
+            </w:r>
+          </w:p>
+        </w:tc>
+      </w:tr>
+      <w:tr>
+        <w:tc>
+          <w:tcPr>
+            <w:tcW w:type="dxa" w:w="3671"/>
+            <w:vAlign w:val="center"/>
+          </w:tcPr>
+          <w:p>
+            <w:pPr>
+              <w:spacing w:after="0"/>
+            </w:pPr>
+            <w:r>
+              <w:t>setup_postgresql.sql</w:t>
+            </w:r>
+          </w:p>
+        </w:tc>
+        <w:tc>
+          <w:tcPr>
+            <w:tcW w:type="dxa" w:w="5688"/>
+            <w:vAlign w:val="center"/>
+          </w:tcPr>
+          <w:p>
+            <w:pPr>
+              <w:spacing w:after="0"/>
+            </w:pPr>
+            <w:r>
+              <w:t>Creates PostgreSQL tables used by Hop.</w:t>
+            </w:r>
+          </w:p>
+        </w:tc>
+      </w:tr>
+      <w:tr>
+        <w:tc>
+          <w:tcPr>
+            <w:tcW w:type="dxa" w:w="3671"/>
+            <w:vAlign w:val="center"/>
+          </w:tcPr>
+          <w:p>
+            <w:pPr>
+              <w:spacing w:after="0"/>
+            </w:pPr>
+            <w:r>
+              <w:t>pipelines/*.hpl</w:t>
+            </w:r>
+          </w:p>
+        </w:tc>
+        <w:tc>
+          <w:tcPr>
+            <w:tcW w:type="dxa" w:w="5688"/>
+            <w:vAlign w:val="center"/>
+          </w:tcPr>
+          <w:p>
+            <w:pPr>
+              <w:spacing w:after="0"/>
+            </w:pPr>
+            <w:r>
+              <w:t>Apache Hop pipeline XML definitions.</w:t>
+            </w:r>
+          </w:p>
+        </w:tc>
+      </w:tr>
+      <w:tr>
+        <w:tc>
+          <w:tcPr>
+            <w:tcW w:type="dxa" w:w="3671"/>
+            <w:vAlign w:val="center"/>
+          </w:tcPr>
+          <w:p>
+            <w:pPr>
+              <w:spacing w:after="0"/>
+            </w:pPr>
+            <w:r>
+              <w:t>workflows/*.hwf</w:t>
+            </w:r>
+          </w:p>
+        </w:tc>
+        <w:tc>
+          <w:tcPr>
+            <w:tcW w:type="dxa" w:w="5688"/>
+            <w:vAlign w:val="center"/>
+          </w:tcPr>
+          <w:p>
+            <w:pPr>
+              <w:spacing w:after="0"/>
+            </w:pPr>
+            <w:r>
+              <w:t>Apache Hop workflow XML definition.</w:t>
+            </w:r>
+          </w:p>
+        </w:tc>
+      </w:tr>
+      <w:tr>
+        <w:tc>
+          <w:tcPr>
+            <w:tcW w:type="dxa" w:w="3671"/>
+            <w:vAlign w:val="center"/>
+          </w:tcPr>
+          <w:p>
+            <w:pPr>
+              <w:spacing w:after="0"/>
+            </w:pPr>
+            <w:r>
+              <w:t>metadata/rdbms/PostgreSQL_Medallion.json</w:t>
+            </w:r>
+          </w:p>
+        </w:tc>
+        <w:tc>
+          <w:tcPr>
+            <w:tcW w:type="dxa" w:w="5688"/>
+            <w:vAlign w:val="center"/>
+          </w:tcPr>
+          <w:p>
+            <w:pPr>
+              <w:spacing w:after="0"/>
+            </w:pPr>
+            <w:r>
+              <w:t>Reusable Hop PostgreSQL connection metadata.</w:t>
+            </w:r>
+          </w:p>
+        </w:tc>
+      </w:tr>
+    </w:tbl>
+    <w:p/>
+    <w:p>
+      <w:pPr>
+        <w:pStyle w:val="Heading1"/>
+      </w:pPr>
+      <w:r>
+        <w:t>Start The Lab</w:t>
       </w:r>
     </w:p>
     <w:p>
       <w:pPr>
-        <w:spacing w:before="80" w:after="160"/>
+        <w:pStyle w:val="CodeBlock"/>
       </w:pPr>
       <w:r>
-        <w:rPr>
-          <w:rFonts w:ascii="Consolas" w:hAnsi="Consolas" w:eastAsia="Consolas"/>
-          <w:sz w:val="17"/>
-        </w:rPr>
-        <w:t># Install Docker if needed on Ubuntu/Linux.</w:t>
+        <w:t>cd Week_02/Day_06/Lab_Files</w:t>
       </w:r>
+    </w:p>
+    <w:p>
+      <w:pPr>
+        <w:pStyle w:val="CodeBlock"/>
+      </w:pPr>
       <w:r>
-        <w:br/>
+        <w:t>python generate_data.py</w:t>
       </w:r>
+    </w:p>
+    <w:p>
+      <w:pPr>
+        <w:pStyle w:val="CodeBlock"/>
+      </w:pPr>
       <w:r>
-        <w:rPr>
-          <w:rFonts w:ascii="Consolas" w:hAnsi="Consolas" w:eastAsia="Consolas"/>
-          <w:sz w:val="17"/>
-        </w:rPr>
-        <w:t>sudo apt-get update</w:t>
+        <w:t>docker compose down --remove-orphans</w:t>
       </w:r>
+    </w:p>
+    <w:p>
+      <w:pPr>
+        <w:pStyle w:val="CodeBlock"/>
+      </w:pPr>
       <w:r>
-        <w:br/>
+        <w:t>docker compose up -d</w:t>
       </w:r>
+    </w:p>
+    <w:p>
+      <w:pPr>
+        <w:pStyle w:val="CodeBlock"/>
+      </w:pPr>
       <w:r>
-        <w:rPr>
-          <w:rFonts w:ascii="Consolas" w:hAnsi="Consolas" w:eastAsia="Consolas"/>
-          <w:sz w:val="17"/>
-        </w:rPr>
-        <w:t>sudo apt-get install -y ca-certificates curl gnupg</w:t>
+        <w:t>docker compose ps</w:t>
       </w:r>
+    </w:p>
+    <w:p>
       <w:r>
-        <w:br/>
+        <w:t>Open Hop Web at http://localhost:8082/ui. In Hop, use project home /project and open files from /project/pipelines or /project/workflows.</w:t>
       </w:r>
+    </w:p>
+    <w:p>
+      <w:pPr>
+        <w:pStyle w:val="SmallNote"/>
+      </w:pPr>
       <w:r>
-        <w:rPr>
-          <w:rFonts w:ascii="Consolas" w:hAnsi="Consolas" w:eastAsia="Consolas"/>
-          <w:sz w:val="17"/>
-        </w:rPr>
-        <w:t>sudo install -m 0755 -d /etc/apt/keyrings</w:t>
+        <w:t>Optional CLI runner:</w:t>
       </w:r>
+    </w:p>
+    <w:p>
+      <w:pPr>
+        <w:pStyle w:val="CodeBlock"/>
+      </w:pPr>
       <w:r>
-        <w:br/>
-      </w:r>
-      <w:r>
-        <w:rPr>
-          <w:rFonts w:ascii="Consolas" w:hAnsi="Consolas" w:eastAsia="Consolas"/>
-          <w:sz w:val="17"/>
-        </w:rPr>
-        <w:t>curl -fsSL https://download.docker.com/linux/ubuntu/gpg | sudo gpg --dearmor -o /etc/apt/keyrings/docker.gpg</w:t>
-      </w:r>
-      <w:r>
-        <w:br/>
-      </w:r>
-      <w:r>
-        <w:rPr>
-          <w:rFonts w:ascii="Consolas" w:hAnsi="Consolas" w:eastAsia="Consolas"/>
-          <w:sz w:val="17"/>
-        </w:rPr>
-        <w:t>sudo chmod a+r /etc/apt/keyrings/docker.gpg</w:t>
-      </w:r>
-      <w:r>
-        <w:br/>
-      </w:r>
-      <w:r>
-        <w:rPr>
-          <w:rFonts w:ascii="Consolas" w:hAnsi="Consolas" w:eastAsia="Consolas"/>
-          <w:sz w:val="17"/>
-        </w:rPr>
-        <w:t>. /etc/os-release</w:t>
-      </w:r>
-      <w:r>
-        <w:br/>
-      </w:r>
-      <w:r>
-        <w:rPr>
-          <w:rFonts w:ascii="Consolas" w:hAnsi="Consolas" w:eastAsia="Consolas"/>
-          <w:sz w:val="17"/>
-        </w:rPr>
-        <w:t>echo "deb [arch=$(dpkg --print-architecture) signed-by=/etc/apt/keyrings/docker.gpg] https://download.docker.com/linux/ubuntu $VERSION_CODENAME stable" | sudo tee /etc/apt/sources.list.d/docker.list &gt; /dev/null</w:t>
-      </w:r>
-      <w:r>
-        <w:br/>
-      </w:r>
-      <w:r>
-        <w:rPr>
-          <w:rFonts w:ascii="Consolas" w:hAnsi="Consolas" w:eastAsia="Consolas"/>
-          <w:sz w:val="17"/>
-        </w:rPr>
-        <w:t>sudo apt-get update</w:t>
-      </w:r>
-      <w:r>
-        <w:br/>
-      </w:r>
-      <w:r>
-        <w:rPr>
-          <w:rFonts w:ascii="Consolas" w:hAnsi="Consolas" w:eastAsia="Consolas"/>
-          <w:sz w:val="17"/>
-        </w:rPr>
-        <w:t>sudo apt-get install -y docker-ce docker-ce-cli containerd.io docker-buildx-plugin docker-compose-plugin</w:t>
+        <w:t>docker compose --profile cli up -d hop-cli</w:t>
       </w:r>
     </w:p>
     <w:p>
@@ -414,7 +1139,12 @@
         <w:pStyle w:val="Heading1"/>
       </w:pPr>
       <w:r>
-        <w:t>Install / Start with Docker on Windows</w:t>
+        <w:t>Exercise 0 - Build Your First Pipeline</w:t>
+      </w:r>
+    </w:p>
+    <w:p>
+      <w:r>
+        <w:t>This exercise follows the Medium article flow using this lab?s local files and a ready-made Hop XML reference.</w:t>
       </w:r>
     </w:p>
     <w:p>
@@ -422,7 +1152,7 @@
         <w:pStyle w:val="ListNumber"/>
       </w:pPr>
       <w:r>
-        <w:t>Install Docker Desktop for Windows.</w:t>
+        <w:t>In Hop Web, create or open the project mounted at /project.</w:t>
       </w:r>
     </w:p>
     <w:p>
@@ -430,7 +1160,7 @@
         <w:pStyle w:val="ListNumber"/>
       </w:pPr>
       <w:r>
-        <w:t>Enable WSL 2 backend during setup.</w:t>
+        <w:t>Open pipelines/00_first_pipeline_csv_to_csv.hpl, or manually create a new pipeline.</w:t>
       </w:r>
     </w:p>
     <w:p>
@@ -438,7 +1168,7 @@
         <w:pStyle w:val="ListNumber"/>
       </w:pPr>
       <w:r>
-        <w:t>Open Docker Desktop and wait until Docker Engine is running.</w:t>
+        <w:t>Add a CSV File Input transform and point it to ${PROJECT_HOME}/data/first_pipeline_source.csv.</w:t>
       </w:r>
     </w:p>
     <w:p>
@@ -446,7 +1176,7 @@
         <w:pStyle w:val="ListNumber"/>
       </w:pPr>
       <w:r>
-        <w:t>Open PowerShell or WSL Ubuntu.</w:t>
+        <w:t>Use Get Fields and Preview to verify field names and encoding.</w:t>
       </w:r>
     </w:p>
     <w:p>
@@ -454,7 +1184,7 @@
         <w:pStyle w:val="ListNumber"/>
       </w:pPr>
       <w:r>
-        <w:t>Run docker --version and docker compose version.</w:t>
+        <w:t>Add a Text File Output transform and set the output base name to ${PROJECT_HOME}/output/first_pipeline_result.</w:t>
       </w:r>
     </w:p>
     <w:p>
@@ -462,7 +1192,15 @@
         <w:pStyle w:val="ListNumber"/>
       </w:pPr>
       <w:r>
-        <w:t>Run this lab from Week_02/Day_06/Lab_Files.</w:t>
+        <w:t>Connect the transforms with a hop using Main output.</w:t>
+      </w:r>
+    </w:p>
+    <w:p>
+      <w:pPr>
+        <w:pStyle w:val="ListNumber"/>
+      </w:pPr>
+      <w:r>
+        <w:t>Run the pipeline and verify output/first_pipeline_result.csv.</w:t>
       </w:r>
     </w:p>
     <w:p>
@@ -470,39 +1208,31 @@
         <w:pStyle w:val="Heading1"/>
       </w:pPr>
       <w:r>
-        <w:t>Step 1 - Stop Old Containers</w:t>
+        <w:t>Exercise 1 - Batch CSV Cleaning</w:t>
       </w:r>
     </w:p>
     <w:p>
       <w:pPr>
-        <w:spacing w:before="80" w:after="160"/>
+        <w:pStyle w:val="ListBullet"/>
       </w:pPr>
       <w:r>
-        <w:rPr>
-          <w:rFonts w:ascii="Consolas" w:hAnsi="Consolas" w:eastAsia="Consolas"/>
-          <w:sz w:val="17"/>
-        </w:rPr>
-        <w:t>cd Week_02/Day_06/Lab_Files</w:t>
+        <w:t>Open pipelines/01_clean_customers.hpl.</w:t>
       </w:r>
+    </w:p>
+    <w:p>
+      <w:pPr>
+        <w:pStyle w:val="ListBullet"/>
+      </w:pPr>
       <w:r>
-        <w:br/>
+        <w:t>Run the pipeline and inspect output/customers_cleaned.csv and output/customers_rejected.csv.</w:t>
       </w:r>
+    </w:p>
+    <w:p>
+      <w:pPr>
+        <w:pStyle w:val="ListBullet"/>
+      </w:pPr>
       <w:r>
-        <w:rPr>
-          <w:rFonts w:ascii="Consolas" w:hAnsi="Consolas" w:eastAsia="Consolas"/>
-          <w:sz w:val="17"/>
-        </w:rPr>
-        <w:t>sudo docker compose down</w:t>
-      </w:r>
-      <w:r>
-        <w:br/>
-      </w:r>
-      <w:r>
-        <w:rPr>
-          <w:rFonts w:ascii="Consolas" w:hAnsi="Consolas" w:eastAsia="Consolas"/>
-          <w:sz w:val="17"/>
-        </w:rPr>
-        <w:t>sudo docker rm -f hop-web apache-hop-server</w:t>
+        <w:t>Concepts: JavaScript transform, filter rows, sort rows, unique rows, reject output, text file output.</w:t>
       </w:r>
     </w:p>
     <w:p>
@@ -510,39 +1240,31 @@
         <w:pStyle w:val="Heading1"/>
       </w:pPr>
       <w:r>
-        <w:t>Step 2 - Start Kafka, Schema Registry, and Kafka UI</w:t>
+        <w:t>Exercise 2 - Lookup, String, And Math Operations</w:t>
       </w:r>
     </w:p>
     <w:p>
       <w:pPr>
-        <w:spacing w:before="80" w:after="160"/>
+        <w:pStyle w:val="ListBullet"/>
       </w:pPr>
       <w:r>
-        <w:rPr>
-          <w:rFonts w:ascii="Consolas" w:hAnsi="Consolas" w:eastAsia="Consolas"/>
-          <w:sz w:val="17"/>
-        </w:rPr>
-        <w:t>cd Week_02/Day_06/Lab_Files</w:t>
+        <w:t>Open pipelines/02_enrich_orders.hpl.</w:t>
       </w:r>
+    </w:p>
+    <w:p>
+      <w:pPr>
+        <w:pStyle w:val="ListBullet"/>
+      </w:pPr>
       <w:r>
-        <w:br/>
+        <w:t>Run the pipeline and inspect output/orders_enriched.csv.</w:t>
       </w:r>
+    </w:p>
+    <w:p>
+      <w:pPr>
+        <w:pStyle w:val="ListBullet"/>
+      </w:pPr>
       <w:r>
-        <w:rPr>
-          <w:rFonts w:ascii="Consolas" w:hAnsi="Consolas" w:eastAsia="Consolas"/>
-          <w:sz w:val="17"/>
-        </w:rPr>
-        <w:t>sudo docker compose up -d</w:t>
-      </w:r>
-      <w:r>
-        <w:br/>
-      </w:r>
-      <w:r>
-        <w:rPr>
-          <w:rFonts w:ascii="Consolas" w:hAnsi="Consolas" w:eastAsia="Consolas"/>
-          <w:sz w:val="17"/>
-        </w:rPr>
-        <w:t>sudo docker compose ps</w:t>
+        <w:t>Concepts: stream lookup, product enrichment, category normalization, tax/discount/net calculations.</w:t>
       </w:r>
     </w:p>
     <w:p>
@@ -550,120 +1272,31 @@
         <w:pStyle w:val="Heading1"/>
       </w:pPr>
       <w:r>
-        <w:t>Step 3 - Start Apache Hop Web and Hop Server</w:t>
+        <w:t>Exercise 3 - Real Database Write And Read</w:t>
       </w:r>
     </w:p>
     <w:p>
       <w:pPr>
-        <w:spacing w:before="80" w:after="160"/>
+        <w:pStyle w:val="ListBullet"/>
       </w:pPr>
       <w:r>
-        <w:rPr>
-          <w:rFonts w:ascii="Consolas" w:hAnsi="Consolas" w:eastAsia="Consolas"/>
-          <w:sz w:val="17"/>
-        </w:rPr>
-        <w:t>sudo docker run -d --rm --name hop-web -p 8082:8080 apache/hop-web</w:t>
-      </w:r>
-      <w:r>
-        <w:br/>
-      </w:r>
-      <w:r>
-        <w:rPr>
-          <w:rFonts w:ascii="Consolas" w:hAnsi="Consolas" w:eastAsia="Consolas"/>
-          <w:sz w:val="17"/>
-        </w:rPr>
-      </w:r>
-      <w:r>
-        <w:br/>
-      </w:r>
-      <w:r>
-        <w:rPr>
-          <w:rFonts w:ascii="Consolas" w:hAnsi="Consolas" w:eastAsia="Consolas"/>
-          <w:sz w:val="17"/>
-        </w:rPr>
-        <w:t>sudo docker run -d --rm --name apache-hop-server   -e HOP_SERVER_USER=admin   -e HOP_SERVER_PASS=admin   -e HOP_SERVER_HOSTNAME=0.0.0.0   -e HOP_SERVER_PORT=8181   -p 8181:8181   apache/hop</w:t>
+        <w:t>Run pipelines/03_write_customers_postgres.hpl after Exercise 1 has created customers_cleaned.csv.</w:t>
       </w:r>
     </w:p>
     <w:p>
+      <w:pPr>
+        <w:pStyle w:val="ListBullet"/>
+      </w:pPr>
       <w:r>
-        <w:t>Open Hop Web at http://localhost:8082/ui. This is the visual UI to create pipelines and workflows.</w:t>
+        <w:t>Run pipelines/04_read_customers_postgres.hpl and inspect output/postgres_customers_de.csv.</w:t>
       </w:r>
     </w:p>
     <w:p>
+      <w:pPr>
+        <w:pStyle w:val="ListBullet"/>
+      </w:pPr>
       <w:r>
-        <w:drawing>
-          <wp:inline xmlns:a="http://schemas.openxmlformats.org/drawingml/2006/main" xmlns:pic="http://schemas.openxmlformats.org/drawingml/2006/picture">
-            <wp:extent cx="6126480" cy="3675888"/>
-            <wp:docPr id="1" name="Picture 1"/>
-            <wp:cNvGraphicFramePr>
-              <a:graphicFrameLocks noChangeAspect="1"/>
-            </wp:cNvGraphicFramePr>
-            <a:graphic>
-              <a:graphicData uri="http://schemas.openxmlformats.org/drawingml/2006/picture">
-                <pic:pic>
-                  <pic:nvPicPr>
-                    <pic:cNvPr id="0" name="01-hop-web-real.png"/>
-                    <pic:cNvPicPr/>
-                  </pic:nvPicPr>
-                  <pic:blipFill>
-                    <a:blip r:embed="rId9"/>
-                    <a:stretch>
-                      <a:fillRect/>
-                    </a:stretch>
-                  </pic:blipFill>
-                  <pic:spPr>
-                    <a:xfrm>
-                      <a:off x="0" y="0"/>
-                      <a:ext cx="6126480" cy="3675888"/>
-                    </a:xfrm>
-                    <a:prstGeom prst="rect"/>
-                  </pic:spPr>
-                </pic:pic>
-              </a:graphicData>
-            </a:graphic>
-          </wp:inline>
-        </w:drawing>
-      </w:r>
-    </w:p>
-    <w:p>
-      <w:r>
-        <w:t>Hop Server at http://localhost:8181 is only the runtime/status endpoint.</w:t>
-      </w:r>
-    </w:p>
-    <w:p>
-      <w:r>
-        <w:drawing>
-          <wp:inline xmlns:a="http://schemas.openxmlformats.org/drawingml/2006/main" xmlns:pic="http://schemas.openxmlformats.org/drawingml/2006/picture">
-            <wp:extent cx="6126480" cy="3675888"/>
-            <wp:docPr id="2" name="Picture 2"/>
-            <wp:cNvGraphicFramePr>
-              <a:graphicFrameLocks noChangeAspect="1"/>
-            </wp:cNvGraphicFramePr>
-            <a:graphic>
-              <a:graphicData uri="http://schemas.openxmlformats.org/drawingml/2006/picture">
-                <pic:pic>
-                  <pic:nvPicPr>
-                    <pic:cNvPr id="0" name="03-hop-server-real.png"/>
-                    <pic:cNvPicPr/>
-                  </pic:nvPicPr>
-                  <pic:blipFill>
-                    <a:blip r:embed="rId10"/>
-                    <a:stretch>
-                      <a:fillRect/>
-                    </a:stretch>
-                  </pic:blipFill>
-                  <pic:spPr>
-                    <a:xfrm>
-                      <a:off x="0" y="0"/>
-                      <a:ext cx="6126480" cy="3675888"/>
-                    </a:xfrm>
-                    <a:prstGeom prst="rect"/>
-                  </pic:spPr>
-                </pic:pic>
-              </a:graphicData>
-            </a:graphic>
-          </wp:inline>
-        </w:drawing>
+        <w:t>Concepts: reusable database metadata, Table Output, Table Input, SQL filtering, database verification.</w:t>
       </w:r>
     </w:p>
     <w:p>
@@ -671,52 +1304,55 @@
         <w:pStyle w:val="Heading1"/>
       </w:pPr>
       <w:r>
-        <w:t>Exercise 1 - Batch Cleaning Pipeline</w:t>
-      </w:r>
-    </w:p>
-    <w:p>
-      <w:r>
-        <w:t>Target Hop design: Text File Input -&gt; Filter Rows -&gt; Select Values/Formula -&gt; Sort Rows -&gt; Unique Rows -&gt; Text File Output.</w:t>
+        <w:t>Exercise 4 - Kafka Streaming</w:t>
       </w:r>
     </w:p>
     <w:p>
       <w:pPr>
-        <w:pStyle w:val="ListNumber"/>
+        <w:pStyle w:val="CodeBlock"/>
       </w:pPr>
       <w:r>
-        <w:t>Read customers.csv.</w:t>
+        <w:t>pip install -r requirements.txt</w:t>
       </w:r>
     </w:p>
     <w:p>
       <w:pPr>
-        <w:pStyle w:val="ListNumber"/>
+        <w:pStyle w:val="CodeBlock"/>
       </w:pPr>
       <w:r>
-        <w:t>Normalize phone numbers from 00... to +....</w:t>
+        <w:t>python orders_producer.py</w:t>
       </w:r>
     </w:p>
     <w:p>
       <w:pPr>
-        <w:pStyle w:val="ListNumber"/>
+        <w:pStyle w:val="ListBullet"/>
       </w:pPr>
       <w:r>
-        <w:t>Sort by customer_id.</w:t>
+        <w:t>Open pipelines/05_consume_orders_kafka.hpl and run it.</w:t>
       </w:r>
     </w:p>
     <w:p>
       <w:pPr>
-        <w:pStyle w:val="ListNumber"/>
+        <w:pStyle w:val="ListBullet"/>
       </w:pPr>
       <w:r>
-        <w:t>Remove duplicate customer records.</w:t>
+        <w:t>The parent pipeline calls pipelines/06_kafka_order_batch_subpipeline.hpl, which starts with an Injector.</w:t>
       </w:r>
     </w:p>
     <w:p>
       <w:pPr>
-        <w:pStyle w:val="ListNumber"/>
+        <w:pStyle w:val="ListBullet"/>
       </w:pPr>
       <w:r>
-        <w:t>Write customers_cleaned.csv.</w:t>
+        <w:t>Inspect Kafka UI for orders.cdc, orders.cleaned, and orders.customer_totals.</w:t>
+      </w:r>
+    </w:p>
+    <w:p>
+      <w:pPr>
+        <w:pStyle w:val="ListBullet"/>
+      </w:pPr>
+      <w:r>
+        <w:t>Concepts: Kafka Consumer, sub-pipeline processing, JSON parsing, filtering NEW events, deduplication, Kafka Producer, and batch aggregation.</w:t>
       </w:r>
     </w:p>
     <w:p>
@@ -724,183 +1360,31 @@
         <w:pStyle w:val="Heading1"/>
       </w:pPr>
       <w:r>
-        <w:t>Exercise 2 - Join and Enrich Orders</w:t>
-      </w:r>
-    </w:p>
-    <w:p>
-      <w:r>
-        <w:t>Target Hop design: read orders.csv and products.csv, sort by product_id, join, normalize categories, and write enriched_orders.csv.</w:t>
+        <w:t>Exercise 5 - Workflow Orchestration</w:t>
       </w:r>
     </w:p>
     <w:p>
       <w:pPr>
-        <w:pStyle w:val="Heading1"/>
+        <w:pStyle w:val="ListBullet"/>
       </w:pPr>
       <w:r>
-        <w:t>Exercise 3 - Kafka Streaming Pipeline</w:t>
-      </w:r>
-    </w:p>
-    <w:p>
-      <w:r>
-        <w:t>Produce source CDC-style events, keep only NEW orders, deduplicate by order_id, and publish to orders.cleaned.</w:t>
+        <w:t>Open workflows/01_day6_batch_orchestration.hwf.</w:t>
       </w:r>
     </w:p>
     <w:p>
       <w:pPr>
-        <w:spacing w:before="80" w:after="160"/>
+        <w:pStyle w:val="ListBullet"/>
       </w:pPr>
       <w:r>
-        <w:rPr>
-          <w:rFonts w:ascii="Consolas" w:hAnsi="Consolas" w:eastAsia="Consolas"/>
-          <w:sz w:val="17"/>
-        </w:rPr>
-        <w:t>cd Week_02/Day_06/Lab_Files</w:t>
-      </w:r>
-      <w:r>
-        <w:br/>
-      </w:r>
-      <w:r>
-        <w:rPr>
-          <w:rFonts w:ascii="Consolas" w:hAnsi="Consolas" w:eastAsia="Consolas"/>
-          <w:sz w:val="17"/>
-        </w:rPr>
-        <w:t>python3 orders_producer.py</w:t>
-      </w:r>
-      <w:r>
-        <w:br/>
-      </w:r>
-      <w:r>
-        <w:rPr>
-          <w:rFonts w:ascii="Consolas" w:hAnsi="Consolas" w:eastAsia="Consolas"/>
-          <w:sz w:val="17"/>
-        </w:rPr>
-        <w:t>python3 day6_runnable_equivalent.py</w:t>
-      </w:r>
-    </w:p>
-    <w:p>
-      <w:r>
-        <w:t>Open Kafka UI at http://localhost:8080/ui/clusters/local/all-topics and verify orders.cdc has 3 messages and orders.cleaned has 2 messages.</w:t>
-      </w:r>
-    </w:p>
-    <w:p>
-      <w:r>
-        <w:drawing>
-          <wp:inline xmlns:a="http://schemas.openxmlformats.org/drawingml/2006/main" xmlns:pic="http://schemas.openxmlformats.org/drawingml/2006/picture">
-            <wp:extent cx="6126480" cy="3675888"/>
-            <wp:docPr id="3" name="Picture 3"/>
-            <wp:cNvGraphicFramePr>
-              <a:graphicFrameLocks noChangeAspect="1"/>
-            </wp:cNvGraphicFramePr>
-            <a:graphic>
-              <a:graphicData uri="http://schemas.openxmlformats.org/drawingml/2006/picture">
-                <pic:pic>
-                  <pic:nvPicPr>
-                    <pic:cNvPr id="0" name="02-kafka-ui-topics-real.png"/>
-                    <pic:cNvPicPr/>
-                  </pic:nvPicPr>
-                  <pic:blipFill>
-                    <a:blip r:embed="rId11"/>
-                    <a:stretch>
-                      <a:fillRect/>
-                    </a:stretch>
-                  </pic:blipFill>
-                  <pic:spPr>
-                    <a:xfrm>
-                      <a:off x="0" y="0"/>
-                      <a:ext cx="6126480" cy="3675888"/>
-                    </a:xfrm>
-                    <a:prstGeom prst="rect"/>
-                  </pic:spPr>
-                </pic:pic>
-              </a:graphicData>
-            </a:graphic>
-          </wp:inline>
-        </w:drawing>
+        <w:t>Run the workflow to execute the first pipeline, batch cleaning, enrichment, and PostgreSQL verification path.</w:t>
       </w:r>
     </w:p>
     <w:p>
       <w:pPr>
-        <w:pStyle w:val="Heading1"/>
+        <w:pStyle w:val="ListBullet"/>
       </w:pPr>
       <w:r>
-        <w:t>Validation Output</w:t>
-      </w:r>
-    </w:p>
-    <w:p>
-      <w:pPr>
-        <w:spacing w:before="80" w:after="160"/>
-      </w:pPr>
-      <w:r>
-        <w:rPr>
-          <w:rFonts w:ascii="Consolas" w:hAnsi="Consolas" w:eastAsia="Consolas"/>
-          <w:sz w:val="17"/>
-        </w:rPr>
-        <w:t>Wrote 3 cleaned customers to customers_cleaned.csv</w:t>
-      </w:r>
-      <w:r>
-        <w:br/>
-      </w:r>
-      <w:r>
-        <w:rPr>
-          <w:rFonts w:ascii="Consolas" w:hAnsi="Consolas" w:eastAsia="Consolas"/>
-          <w:sz w:val="17"/>
-        </w:rPr>
-        <w:t>Wrote 3 enriched orders to enriched_orders.csv</w:t>
-      </w:r>
-      <w:r>
-        <w:br/>
-      </w:r>
-      <w:r>
-        <w:rPr>
-          <w:rFonts w:ascii="Consolas" w:hAnsi="Consolas" w:eastAsia="Consolas"/>
-          <w:sz w:val="17"/>
-        </w:rPr>
-        <w:t>Consumed 3 events from orders.cdc</w:t>
-      </w:r>
-      <w:r>
-        <w:br/>
-      </w:r>
-      <w:r>
-        <w:rPr>
-          <w:rFonts w:ascii="Consolas" w:hAnsi="Consolas" w:eastAsia="Consolas"/>
-          <w:sz w:val="17"/>
-        </w:rPr>
-        <w:t>Produced 2 deduplicated NEW events to orders.cleaned</w:t>
-      </w:r>
-    </w:p>
-    <w:p>
-      <w:pPr>
-        <w:pStyle w:val="Heading1"/>
-      </w:pPr>
-      <w:r>
-        <w:t>Exercise 4 - Workflow Orchestration</w:t>
-      </w:r>
-    </w:p>
-    <w:p>
-      <w:r>
-        <w:t>Create a workflow in Hop Web with this shape:</w:t>
-      </w:r>
-    </w:p>
-    <w:p>
-      <w:pPr>
-        <w:spacing w:before="80" w:after="160"/>
-      </w:pPr>
-      <w:r>
-        <w:rPr>
-          <w:rFonts w:ascii="Consolas" w:hAnsi="Consolas" w:eastAsia="Consolas"/>
-          <w:sz w:val="17"/>
-        </w:rPr>
-        <w:t>Start -&gt; Run Pipeline -&gt; Archive processed files -&gt; Log success</w:t>
-      </w:r>
-      <w:r>
-        <w:br/>
-      </w:r>
-      <w:r>
-        <w:rPr>
-          <w:rFonts w:ascii="Consolas" w:hAnsi="Consolas" w:eastAsia="Consolas"/>
-          <w:sz w:val="17"/>
-        </w:rPr>
-        <w:t xml:space="preserve">                         -&gt; Failure path -&gt; Log failure</w:t>
+        <w:t>Concepts: workflow actions, success/failure hops, pipeline orchestration, failure routing.</w:t>
       </w:r>
     </w:p>
     <w:p>
@@ -915,35 +1399,47 @@
       <w:tblPr>
         <w:tblStyle w:val="TableGrid"/>
         <w:tblW w:type="auto" w:w="0"/>
-        <w:jc w:val="center"/>
+        <w:jc w:val="left"/>
         <w:tblLook w:firstColumn="1" w:firstRow="1" w:lastColumn="0" w:lastRow="0" w:noHBand="0" w:noVBand="1" w:val="04A0"/>
       </w:tblPr>
       <w:tblGrid>
-        <w:gridCol w:w="5184"/>
-        <w:gridCol w:w="5184"/>
+        <w:gridCol w:w="4680"/>
+        <w:gridCol w:w="4680"/>
       </w:tblGrid>
       <w:tr>
         <w:tc>
           <w:tcPr>
-            <w:tcW w:type="dxa" w:w="5184"/>
-            <w:shd w:fill="D9EAF7"/>
-            <w:vAlign w:val="top"/>
+            <w:tcW w:type="dxa" w:w="2880"/>
+            <w:shd w:fill="E8EEF5"/>
+            <w:vAlign w:val="center"/>
           </w:tcPr>
           <w:p>
+            <w:pPr>
+              <w:spacing w:after="0"/>
+            </w:pPr>
             <w:r>
+              <w:rPr>
+                <w:b/>
+              </w:rPr>
               <w:t>Issue</w:t>
             </w:r>
           </w:p>
         </w:tc>
         <w:tc>
           <w:tcPr>
-            <w:tcW w:type="dxa" w:w="5184"/>
-            <w:shd w:fill="D9EAF7"/>
-            <w:vAlign w:val="top"/>
+            <w:tcW w:type="dxa" w:w="6480"/>
+            <w:shd w:fill="E8EEF5"/>
+            <w:vAlign w:val="center"/>
           </w:tcPr>
           <w:p>
+            <w:pPr>
+              <w:spacing w:after="0"/>
+            </w:pPr>
             <w:r>
-              <w:t>Fix</w:t>
+              <w:rPr>
+                <w:b/>
+              </w:rPr>
+              <w:t>Check</w:t>
             </w:r>
           </w:p>
         </w:tc>
@@ -951,10 +1447,13 @@
       <w:tr>
         <w:tc>
           <w:tcPr>
-            <w:tcW w:type="dxa" w:w="5184"/>
-            <w:vAlign w:val="top"/>
+            <w:tcW w:type="dxa" w:w="2880"/>
+            <w:vAlign w:val="center"/>
           </w:tcPr>
           <w:p>
+            <w:pPr>
+              <w:spacing w:after="0"/>
+            </w:pPr>
             <w:r>
               <w:t>Hop Web does not open</w:t>
             </w:r>
@@ -962,12 +1461,15 @@
         </w:tc>
         <w:tc>
           <w:tcPr>
-            <w:tcW w:type="dxa" w:w="5184"/>
-            <w:vAlign w:val="top"/>
+            <w:tcW w:type="dxa" w:w="6480"/>
+            <w:vAlign w:val="center"/>
           </w:tcPr>
           <w:p>
+            <w:pPr>
+              <w:spacing w:after="0"/>
+            </w:pPr>
             <w:r>
-              <w:t>Check docker ps and confirm hop-web maps 8082-&gt;8080.</w:t>
+              <w:t>Run docker compose ps and confirm day6-hop-web maps 8082 to 8080.</w:t>
             </w:r>
           </w:p>
         </w:tc>
@@ -975,23 +1477,29 @@
       <w:tr>
         <w:tc>
           <w:tcPr>
-            <w:tcW w:type="dxa" w:w="5184"/>
-            <w:vAlign w:val="top"/>
+            <w:tcW w:type="dxa" w:w="2880"/>
+            <w:vAlign w:val="center"/>
           </w:tcPr>
           <w:p>
+            <w:pPr>
+              <w:spacing w:after="0"/>
+            </w:pPr>
             <w:r>
-              <w:t>Kafka UI does not show orders.cleaned</w:t>
+              <w:t>Pipeline cannot find files</w:t>
             </w:r>
           </w:p>
         </w:tc>
         <w:tc>
           <w:tcPr>
-            <w:tcW w:type="dxa" w:w="5184"/>
-            <w:vAlign w:val="top"/>
+            <w:tcW w:type="dxa" w:w="6480"/>
+            <w:vAlign w:val="center"/>
           </w:tcPr>
           <w:p>
+            <w:pPr>
+              <w:spacing w:after="0"/>
+            </w:pPr>
             <w:r>
-              <w:t>Rerun python3 orders_producer.py and python3 day6_runnable_equivalent.py.</w:t>
+              <w:t>Confirm project home is /project and data exists under /project/data.</w:t>
             </w:r>
           </w:p>
         </w:tc>
@@ -999,23 +1507,29 @@
       <w:tr>
         <w:tc>
           <w:tcPr>
-            <w:tcW w:type="dxa" w:w="5184"/>
-            <w:vAlign w:val="top"/>
+            <w:tcW w:type="dxa" w:w="2880"/>
+            <w:vAlign w:val="center"/>
           </w:tcPr>
           <w:p>
+            <w:pPr>
+              <w:spacing w:after="0"/>
+            </w:pPr>
             <w:r>
-              <w:t>Port 8080 conflict</w:t>
+              <w:t>Kafka topics are empty</w:t>
             </w:r>
           </w:p>
         </w:tc>
         <w:tc>
           <w:tcPr>
-            <w:tcW w:type="dxa" w:w="5184"/>
-            <w:vAlign w:val="top"/>
+            <w:tcW w:type="dxa" w:w="6480"/>
+            <w:vAlign w:val="center"/>
           </w:tcPr>
           <w:p>
+            <w:pPr>
+              <w:spacing w:after="0"/>
+            </w:pPr>
             <w:r>
-              <w:t>Keep Kafka UI on 8080 and run Hop Web on 8082.</w:t>
+              <w:t>Run python orders_producer.py, then inspect Kafka UI at http://localhost:8080.</w:t>
             </w:r>
           </w:p>
         </w:tc>
@@ -1023,34 +1537,101 @@
       <w:tr>
         <w:tc>
           <w:tcPr>
-            <w:tcW w:type="dxa" w:w="5184"/>
-            <w:vAlign w:val="top"/>
+            <w:tcW w:type="dxa" w:w="2880"/>
+            <w:vAlign w:val="center"/>
           </w:tcPr>
           <w:p>
+            <w:pPr>
+              <w:spacing w:after="0"/>
+            </w:pPr>
             <w:r>
-              <w:t>Hop Server opens but no designer appears</w:t>
+              <w:t>Hop cannot connect to Kafka</w:t>
             </w:r>
           </w:p>
         </w:tc>
         <w:tc>
           <w:tcPr>
-            <w:tcW w:type="dxa" w:w="5184"/>
-            <w:vAlign w:val="top"/>
+            <w:tcW w:type="dxa" w:w="6480"/>
+            <w:vAlign w:val="center"/>
           </w:tcPr>
           <w:p>
+            <w:pPr>
+              <w:spacing w:after="0"/>
+            </w:pPr>
             <w:r>
-              <w:t>Use Hop Web at 8082/ui for the visual designer.</w:t>
+              <w:t>Use kafka:29092 inside Hop, not localhost:9092.</w:t>
+            </w:r>
+          </w:p>
+        </w:tc>
+      </w:tr>
+      <w:tr>
+        <w:tc>
+          <w:tcPr>
+            <w:tcW w:type="dxa" w:w="2880"/>
+            <w:vAlign w:val="center"/>
+          </w:tcPr>
+          <w:p>
+            <w:pPr>
+              <w:spacing w:after="0"/>
+            </w:pPr>
+            <w:r>
+              <w:t>Hop cannot connect to PostgreSQL</w:t>
+            </w:r>
+          </w:p>
+        </w:tc>
+        <w:tc>
+          <w:tcPr>
+            <w:tcW w:type="dxa" w:w="6480"/>
+            <w:vAlign w:val="center"/>
+          </w:tcPr>
+          <w:p>
+            <w:pPr>
+              <w:spacing w:after="0"/>
+            </w:pPr>
+            <w:r>
+              <w:t>Confirm metadata/rdbms/PostgreSQL_Medallion.json uses host postgres and day6-postgres is healthy.</w:t>
+            </w:r>
+          </w:p>
+        </w:tc>
+      </w:tr>
+      <w:tr>
+        <w:tc>
+          <w:tcPr>
+            <w:tcW w:type="dxa" w:w="2880"/>
+            <w:vAlign w:val="center"/>
+          </w:tcPr>
+          <w:p>
+            <w:pPr>
+              <w:spacing w:after="0"/>
+            </w:pPr>
+            <w:r>
+              <w:t>Database read returns no rows</w:t>
+            </w:r>
+          </w:p>
+        </w:tc>
+        <w:tc>
+          <w:tcPr>
+            <w:tcW w:type="dxa" w:w="6480"/>
+            <w:vAlign w:val="center"/>
+          </w:tcPr>
+          <w:p>
+            <w:pPr>
+              <w:spacing w:after="0"/>
+            </w:pPr>
+            <w:r>
+              <w:t>Run 01_clean_customers.hpl, then 03_write_customers_postgres.hpl before 04_read_customers_postgres.hpl.</w:t>
             </w:r>
           </w:p>
         </w:tc>
       </w:tr>
     </w:tbl>
+    <w:p/>
     <w:p>
       <w:pPr>
         <w:pStyle w:val="Heading1"/>
       </w:pPr>
       <w:r>
-        <w:t>Official References</w:t>
+        <w:t>Sources</w:t>
       </w:r>
     </w:p>
     <w:p>
@@ -1058,7 +1639,7 @@
         <w:pStyle w:val="ListBullet"/>
       </w:pPr>
       <w:r>
-        <w:t>Docker Engine on Ubuntu: https://docs.docker.com/engine/install/ubuntu/</w:t>
+        <w:t>Samuel Second, Apache Hop, build and run your first pipeline, Medium, 2021-12-30.</w:t>
       </w:r>
     </w:p>
     <w:p>
@@ -1066,28 +1647,12 @@
         <w:pStyle w:val="ListBullet"/>
       </w:pPr>
       <w:r>
-        <w:t>Docker Desktop on Windows: https://docs.docker.com/desktop/setup/install/windows-install/</w:t>
-      </w:r>
-    </w:p>
-    <w:p>
-      <w:pPr>
-        <w:pStyle w:val="ListBullet"/>
-      </w:pPr>
-      <w:r>
-        <w:t>Apache Hop Docker images: https://hub.docker.com/r/apache/hop</w:t>
-      </w:r>
-    </w:p>
-    <w:p>
-      <w:pPr>
-        <w:pStyle w:val="ListBullet"/>
-      </w:pPr>
-      <w:r>
-        <w:t>Kafka UI project: https://github.com/provectus/kafka-ui</w:t>
+        <w:t>Apache Hop User Manual: Hop Web, projects and environments, transform plugins, action plugins, metadata types, Kafka Consumer, Kafka Producer, and PostgreSQL database support.</w:t>
       </w:r>
     </w:p>
     <w:sectPr>
       <w:pgSz w:w="12240" w:h="15840"/>
-      <w:pgMar w:top="792" w:right="936" w:bottom="792" w:left="936" w:header="720" w:footer="720" w:gutter="0"/>
+      <w:pgMar w:top="1440" w:right="1440" w:bottom="1440" w:left="1440" w:header="720" w:footer="720" w:gutter="0"/>
       <w:cols w:space="720"/>
       <w:docGrid w:linePitch="360"/>
     </w:sectPr>
@@ -1458,9 +2023,12 @@
     <w:name w:val="Normal"/>
     <w:qFormat/>
     <w:rsid w:val="00FC693F"/>
+    <w:pPr>
+      <w:spacing w:after="120" w:line="300" w:lineRule="auto"/>
+    </w:pPr>
     <w:rPr>
-      <w:rFonts w:ascii="Arial" w:hAnsi="Arial"/>
-      <w:sz w:val="20"/>
+      <w:rFonts w:ascii="Calibri" w:hAnsi="Calibri" w:eastAsia="Calibri"/>
+      <w:sz w:val="22"/>
     </w:rPr>
   </w:style>
   <w:style w:type="paragraph" w:styleId="Header">
@@ -1518,15 +2086,15 @@
     <w:pPr>
       <w:keepNext/>
       <w:keepLines/>
-      <w:spacing w:before="480" w:after="0"/>
+      <w:spacing w:before="360" w:after="200"/>
       <w:outlineLvl w:val="0"/>
     </w:pPr>
     <w:rPr>
-      <w:rFonts w:asciiTheme="majorHAnsi" w:eastAsiaTheme="majorEastAsia" w:hAnsiTheme="majorHAnsi" w:cstheme="majorBidi" w:ascii="Arial" w:hAnsi="Arial"/>
+      <w:rFonts w:asciiTheme="majorHAnsi" w:eastAsiaTheme="majorEastAsia" w:hAnsiTheme="majorHAnsi" w:cstheme="majorBidi" w:ascii="Calibri" w:hAnsi="Calibri" w:eastAsia="Calibri"/>
       <w:b/>
       <w:bCs/>
-      <w:color w:val="17365D"/>
-      <w:sz w:val="28"/>
+      <w:color w:val="2E74B5"/>
+      <w:sz w:val="32"/>
       <w:szCs w:val="28"/>
     </w:rPr>
   </w:style>
@@ -1542,14 +2110,14 @@
     <w:pPr>
       <w:keepNext/>
       <w:keepLines/>
-      <w:spacing w:before="200" w:after="0"/>
+      <w:spacing w:before="280" w:after="140"/>
       <w:outlineLvl w:val="1"/>
     </w:pPr>
     <w:rPr>
-      <w:rFonts w:asciiTheme="majorHAnsi" w:eastAsiaTheme="majorEastAsia" w:hAnsiTheme="majorHAnsi" w:cstheme="majorBidi" w:ascii="Arial" w:hAnsi="Arial"/>
+      <w:rFonts w:asciiTheme="majorHAnsi" w:eastAsiaTheme="majorEastAsia" w:hAnsiTheme="majorHAnsi" w:cstheme="majorBidi" w:ascii="Calibri" w:hAnsi="Calibri" w:eastAsia="Calibri"/>
       <w:b/>
       <w:bCs/>
-      <w:color w:val="1F4E79"/>
+      <w:color w:val="2E74B5"/>
       <w:sz w:val="26"/>
       <w:szCs w:val="26"/>
     </w:rPr>
@@ -1566,14 +2134,15 @@
     <w:pPr>
       <w:keepNext/>
       <w:keepLines/>
-      <w:spacing w:before="200" w:after="0"/>
+      <w:spacing w:before="200" w:after="100"/>
       <w:outlineLvl w:val="2"/>
     </w:pPr>
     <w:rPr>
-      <w:rFonts w:asciiTheme="majorHAnsi" w:eastAsiaTheme="majorEastAsia" w:hAnsiTheme="majorHAnsi" w:cstheme="majorBidi" w:ascii="Arial" w:hAnsi="Arial"/>
+      <w:rFonts w:asciiTheme="majorHAnsi" w:eastAsiaTheme="majorEastAsia" w:hAnsiTheme="majorHAnsi" w:cstheme="majorBidi" w:ascii="Calibri" w:hAnsi="Calibri" w:eastAsia="Calibri"/>
       <w:b/>
       <w:bCs/>
-      <w:color w:val="4F81BD" w:themeColor="accent1"/>
+      <w:color w:val="1F4D78"/>
+      <w:sz w:val="24"/>
     </w:rPr>
   </w:style>
   <w:style w:type="paragraph" w:styleId="Heading4">
@@ -13144,6 +13713,28 @@
         <w:shd w:val="clear" w:color="auto" w:fill="FBCAA2" w:themeFill="accent6" w:themeFillTint="7F"/>
       </w:tcPr>
     </w:tblStylePr>
+  </w:style>
+  <w:style w:type="paragraph" w:customStyle="1" w:styleId="CodeBlock">
+    <w:name w:val="CodeBlock"/>
+    <w:pPr>
+      <w:spacing w:before="40" w:after="120"/>
+      <w:ind w:left="216"/>
+    </w:pPr>
+    <w:rPr>
+      <w:rFonts w:ascii="Consolas" w:hAnsi="Consolas" w:eastAsia="Consolas"/>
+      <w:sz w:val="19"/>
+    </w:rPr>
+  </w:style>
+  <w:style w:type="paragraph" w:customStyle="1" w:styleId="SmallNote">
+    <w:name w:val="SmallNote"/>
+    <w:pPr>
+      <w:spacing w:after="80"/>
+    </w:pPr>
+    <w:rPr>
+      <w:rFonts w:ascii="Calibri" w:hAnsi="Calibri" w:eastAsia="Calibri"/>
+      <w:color w:val="505050"/>
+      <w:sz w:val="18"/>
+    </w:rPr>
   </w:style>
 </w:styles>
 </file>

</xml_diff>